<commit_message>
Employee Management Kunernetes dic
</commit_message>
<xml_diff>
--- a/AWS_Deployement.docx
+++ b/AWS_Deployement.docx
@@ -407,7 +407,7 @@
           <w:szCs w:val="28"/>
         </w:rPr>
         <w:pict w14:anchorId="6229FBE6">
-          <v:rect id="_x0000_i1271" style="width:0;height:1.5pt" o:hralign="center" o:hrstd="t" o:hr="t" fillcolor="#a0a0a0" stroked="f"/>
+          <v:rect id="_x0000_i1025" style="width:0;height:1.5pt" o:hralign="center" o:hrstd="t" o:hr="t" fillcolor="#a0a0a0" stroked="f"/>
         </w:pict>
       </w:r>
     </w:p>
@@ -1017,7 +1017,7 @@
           <w:szCs w:val="28"/>
         </w:rPr>
         <w:pict w14:anchorId="2511BDF2">
-          <v:rect id="_x0000_i1275" style="width:0;height:1.5pt" o:hralign="center" o:hrstd="t" o:hr="t" fillcolor="#a0a0a0" stroked="f"/>
+          <v:rect id="_x0000_i1026" style="width:0;height:1.5pt" o:hralign="center" o:hrstd="t" o:hr="t" fillcolor="#a0a0a0" stroked="f"/>
         </w:pict>
       </w:r>
     </w:p>
@@ -1059,7 +1059,7 @@
           <w:szCs w:val="28"/>
         </w:rPr>
         <w:pict w14:anchorId="34B0A4BD">
-          <v:rect id="_x0000_i1276" style="width:0;height:1.5pt" o:hralign="center" o:hrstd="t" o:hr="t" fillcolor="#a0a0a0" stroked="f"/>
+          <v:rect id="_x0000_i1027" style="width:0;height:1.5pt" o:hralign="center" o:hrstd="t" o:hr="t" fillcolor="#a0a0a0" stroked="f"/>
         </w:pict>
       </w:r>
     </w:p>
@@ -1077,6 +1077,7 @@
       <w:r>
         <w:rPr>
           <w:rFonts w:ascii="Calibri" w:hAnsi="Calibri" w:cs="Calibri"/>
+          <w:noProof/>
           <w:sz w:val="28"/>
           <w:szCs w:val="28"/>
         </w:rPr>
@@ -1215,6 +1216,7 @@
           <w:bCs/>
           <w:sz w:val="28"/>
           <w:szCs w:val="28"/>
+          <w:highlight w:val="yellow"/>
         </w:rPr>
         <w:t>What You Do</w:t>
       </w:r>
@@ -1636,7 +1638,7 @@
           <w:szCs w:val="28"/>
         </w:rPr>
         <w:pict w14:anchorId="5403279C">
-          <v:rect id="_x0000_i1280" style="width:0;height:1.5pt" o:hralign="center" o:hrstd="t" o:hr="t" fillcolor="#a0a0a0" stroked="f"/>
+          <v:rect id="_x0000_i1028" style="width:0;height:1.5pt" o:hralign="center" o:hrstd="t" o:hr="t" fillcolor="#a0a0a0" stroked="f"/>
         </w:pict>
       </w:r>
     </w:p>
@@ -1687,196 +1689,12 @@
         <w:pStyle w:val="NoSpacing"/>
         <w:rPr>
           <w:rFonts w:ascii="Calibri" w:hAnsi="Calibri" w:cs="Calibri"/>
-          <w:sz w:val="28"/>
-          <w:szCs w:val="28"/>
-        </w:rPr>
-      </w:pPr>
-      <w:r>
-        <w:rPr>
-          <w:rFonts w:ascii="Calibri" w:hAnsi="Calibri" w:cs="Calibri"/>
-          <w:sz w:val="28"/>
-          <w:szCs w:val="28"/>
-        </w:rPr>
-        <w:drawing>
-          <wp:inline distT="0" distB="0" distL="0" distR="0" wp14:anchorId="18137433" wp14:editId="2590FD5D">
-            <wp:extent cx="5731510" cy="2547620"/>
-            <wp:effectExtent l="0" t="0" r="2540" b="5080"/>
-            <wp:docPr id="1659307936" name="Picture 54"/>
-            <wp:cNvGraphicFramePr>
-              <a:graphicFrameLocks xmlns:a="http://schemas.openxmlformats.org/drawingml/2006/main" noChangeAspect="1"/>
-            </wp:cNvGraphicFramePr>
-            <a:graphic xmlns:a="http://schemas.openxmlformats.org/drawingml/2006/main">
-              <a:graphicData uri="http://schemas.openxmlformats.org/drawingml/2006/picture">
-                <pic:pic xmlns:pic="http://schemas.openxmlformats.org/drawingml/2006/picture">
-                  <pic:nvPicPr>
-                    <pic:cNvPr id="0" name="Picture 257"/>
-                    <pic:cNvPicPr>
-                      <a:picLocks noChangeAspect="1" noChangeArrowheads="1"/>
-                    </pic:cNvPicPr>
-                  </pic:nvPicPr>
-                  <pic:blipFill>
-                    <a:blip r:embed="rId6" cstate="print">
-                      <a:extLst>
-                        <a:ext uri="{28A0092B-C50C-407E-A947-70E740481C1C}">
-                          <a14:useLocalDpi xmlns:a14="http://schemas.microsoft.com/office/drawing/2010/main" val="0"/>
-                        </a:ext>
-                      </a:extLst>
-                    </a:blip>
-                    <a:srcRect/>
-                    <a:stretch>
-                      <a:fillRect/>
-                    </a:stretch>
-                  </pic:blipFill>
-                  <pic:spPr bwMode="auto">
-                    <a:xfrm>
-                      <a:off x="0" y="0"/>
-                      <a:ext cx="5731510" cy="2547620"/>
-                    </a:xfrm>
-                    <a:prstGeom prst="rect">
-                      <a:avLst/>
-                    </a:prstGeom>
-                    <a:noFill/>
-                    <a:ln>
-                      <a:noFill/>
-                    </a:ln>
-                  </pic:spPr>
-                </pic:pic>
-              </a:graphicData>
-            </a:graphic>
-          </wp:inline>
-        </w:drawing>
-      </w:r>
-    </w:p>
-    <w:p>
-      <w:pPr>
-        <w:pStyle w:val="NoSpacing"/>
-        <w:rPr>
-          <w:rFonts w:ascii="Calibri" w:hAnsi="Calibri" w:cs="Calibri"/>
-          <w:sz w:val="28"/>
-          <w:szCs w:val="28"/>
-        </w:rPr>
-      </w:pPr>
-      <w:r>
-        <w:rPr>
-          <w:rFonts w:ascii="Calibri" w:hAnsi="Calibri" w:cs="Calibri"/>
-          <w:sz w:val="28"/>
-          <w:szCs w:val="28"/>
-        </w:rPr>
-        <w:drawing>
-          <wp:inline distT="0" distB="0" distL="0" distR="0" wp14:anchorId="3D5D8AEA" wp14:editId="08436C22">
-            <wp:extent cx="5731510" cy="2651760"/>
-            <wp:effectExtent l="0" t="0" r="2540" b="0"/>
-            <wp:docPr id="223361230" name="Picture 53"/>
-            <wp:cNvGraphicFramePr>
-              <a:graphicFrameLocks xmlns:a="http://schemas.openxmlformats.org/drawingml/2006/main" noChangeAspect="1"/>
-            </wp:cNvGraphicFramePr>
-            <a:graphic xmlns:a="http://schemas.openxmlformats.org/drawingml/2006/main">
-              <a:graphicData uri="http://schemas.openxmlformats.org/drawingml/2006/picture">
-                <pic:pic xmlns:pic="http://schemas.openxmlformats.org/drawingml/2006/picture">
-                  <pic:nvPicPr>
-                    <pic:cNvPr id="0" name="Picture 258"/>
-                    <pic:cNvPicPr>
-                      <a:picLocks noChangeAspect="1" noChangeArrowheads="1"/>
-                    </pic:cNvPicPr>
-                  </pic:nvPicPr>
-                  <pic:blipFill>
-                    <a:blip r:embed="rId7" cstate="print">
-                      <a:extLst>
-                        <a:ext uri="{28A0092B-C50C-407E-A947-70E740481C1C}">
-                          <a14:useLocalDpi xmlns:a14="http://schemas.microsoft.com/office/drawing/2010/main" val="0"/>
-                        </a:ext>
-                      </a:extLst>
-                    </a:blip>
-                    <a:srcRect/>
-                    <a:stretch>
-                      <a:fillRect/>
-                    </a:stretch>
-                  </pic:blipFill>
-                  <pic:spPr bwMode="auto">
-                    <a:xfrm>
-                      <a:off x="0" y="0"/>
-                      <a:ext cx="5731510" cy="2651760"/>
-                    </a:xfrm>
-                    <a:prstGeom prst="rect">
-                      <a:avLst/>
-                    </a:prstGeom>
-                    <a:noFill/>
-                    <a:ln>
-                      <a:noFill/>
-                    </a:ln>
-                  </pic:spPr>
-                </pic:pic>
-              </a:graphicData>
-            </a:graphic>
-          </wp:inline>
-        </w:drawing>
-      </w:r>
-    </w:p>
-    <w:p>
-      <w:pPr>
-        <w:pStyle w:val="NoSpacing"/>
-        <w:rPr>
-          <w:rFonts w:ascii="Calibri" w:hAnsi="Calibri" w:cs="Calibri"/>
-          <w:sz w:val="28"/>
-          <w:szCs w:val="28"/>
-        </w:rPr>
-      </w:pPr>
-      <w:r>
-        <w:rPr>
-          <w:rFonts w:ascii="Calibri" w:hAnsi="Calibri" w:cs="Calibri"/>
-          <w:sz w:val="28"/>
-          <w:szCs w:val="28"/>
-        </w:rPr>
-        <w:lastRenderedPageBreak/>
-        <w:drawing>
-          <wp:inline distT="0" distB="0" distL="0" distR="0" wp14:anchorId="48A70A4D" wp14:editId="257A2745">
-            <wp:extent cx="5200650" cy="4419600"/>
-            <wp:effectExtent l="0" t="0" r="0" b="0"/>
-            <wp:docPr id="1720390702" name="Picture 52"/>
-            <wp:cNvGraphicFramePr>
-              <a:graphicFrameLocks xmlns:a="http://schemas.openxmlformats.org/drawingml/2006/main" noChangeAspect="1"/>
-            </wp:cNvGraphicFramePr>
-            <a:graphic xmlns:a="http://schemas.openxmlformats.org/drawingml/2006/main">
-              <a:graphicData uri="http://schemas.openxmlformats.org/drawingml/2006/picture">
-                <pic:pic xmlns:pic="http://schemas.openxmlformats.org/drawingml/2006/picture">
-                  <pic:nvPicPr>
-                    <pic:cNvPr id="0" name="Picture 259"/>
-                    <pic:cNvPicPr>
-                      <a:picLocks noChangeAspect="1" noChangeArrowheads="1"/>
-                    </pic:cNvPicPr>
-                  </pic:nvPicPr>
-                  <pic:blipFill>
-                    <a:blip r:embed="rId8">
-                      <a:extLst>
-                        <a:ext uri="{28A0092B-C50C-407E-A947-70E740481C1C}">
-                          <a14:useLocalDpi xmlns:a14="http://schemas.microsoft.com/office/drawing/2010/main" val="0"/>
-                        </a:ext>
-                      </a:extLst>
-                    </a:blip>
-                    <a:srcRect/>
-                    <a:stretch>
-                      <a:fillRect/>
-                    </a:stretch>
-                  </pic:blipFill>
-                  <pic:spPr bwMode="auto">
-                    <a:xfrm>
-                      <a:off x="0" y="0"/>
-                      <a:ext cx="5200650" cy="4419600"/>
-                    </a:xfrm>
-                    <a:prstGeom prst="rect">
-                      <a:avLst/>
-                    </a:prstGeom>
-                    <a:noFill/>
-                    <a:ln>
-                      <a:noFill/>
-                    </a:ln>
-                  </pic:spPr>
-                </pic:pic>
-              </a:graphicData>
-            </a:graphic>
-          </wp:inline>
-        </w:drawing>
-      </w:r>
+          <w:b/>
+          <w:bCs/>
+          <w:sz w:val="28"/>
+          <w:szCs w:val="28"/>
+        </w:rPr>
+      </w:pPr>
     </w:p>
     <w:p>
       <w:pPr>
@@ -2212,7 +2030,7 @@
           <w:szCs w:val="28"/>
         </w:rPr>
         <w:pict w14:anchorId="4B42F6E7">
-          <v:rect id="_x0000_i1284" style="width:0;height:1.5pt" o:hralign="center" o:hrstd="t" o:hr="t" fillcolor="#a0a0a0" stroked="f"/>
+          <v:rect id="_x0000_i1029" style="width:0;height:1.5pt" o:hralign="center" o:hrstd="t" o:hr="t" fillcolor="#a0a0a0" stroked="f"/>
         </w:pict>
       </w:r>
     </w:p>
@@ -2443,7 +2261,6 @@
           <w:sz w:val="28"/>
           <w:szCs w:val="28"/>
         </w:rPr>
-        <w:lastRenderedPageBreak/>
         <w:t>No dependency on developer machine</w:t>
       </w:r>
     </w:p>
@@ -2485,7 +2302,7 @@
           <w:szCs w:val="28"/>
         </w:rPr>
         <w:pict w14:anchorId="6306C7F8">
-          <v:rect id="_x0000_i1285" style="width:0;height:1.5pt" o:hralign="center" o:hrstd="t" o:hr="t" fillcolor="#a0a0a0" stroked="f"/>
+          <v:rect id="_x0000_i1030" style="width:0;height:1.5pt" o:hralign="center" o:hrstd="t" o:hr="t" fillcolor="#a0a0a0" stroked="f"/>
         </w:pict>
       </w:r>
     </w:p>
@@ -2543,9 +2360,11 @@
       <w:r>
         <w:rPr>
           <w:rFonts w:ascii="Calibri" w:hAnsi="Calibri" w:cs="Calibri"/>
-          <w:sz w:val="28"/>
-          <w:szCs w:val="28"/>
-        </w:rPr>
+          <w:noProof/>
+          <w:sz w:val="28"/>
+          <w:szCs w:val="28"/>
+        </w:rPr>
+        <w:lastRenderedPageBreak/>
         <w:drawing>
           <wp:inline distT="0" distB="0" distL="0" distR="0" wp14:anchorId="16325CF2" wp14:editId="022078AE">
             <wp:extent cx="5731510" cy="2306320"/>
@@ -2564,7 +2383,7 @@
                     </pic:cNvPicPr>
                   </pic:nvPicPr>
                   <pic:blipFill>
-                    <a:blip r:embed="rId9">
+                    <a:blip r:embed="rId6">
                       <a:extLst>
                         <a:ext uri="{28A0092B-C50C-407E-A947-70E740481C1C}">
                           <a14:useLocalDpi xmlns:a14="http://schemas.microsoft.com/office/drawing/2010/main" val="0"/>
@@ -2608,6 +2427,7 @@
       <w:r>
         <w:rPr>
           <w:rFonts w:ascii="Calibri" w:hAnsi="Calibri" w:cs="Calibri"/>
+          <w:noProof/>
           <w:sz w:val="28"/>
           <w:szCs w:val="28"/>
         </w:rPr>
@@ -2629,7 +2449,7 @@
                     </pic:cNvPicPr>
                   </pic:nvPicPr>
                   <pic:blipFill>
-                    <a:blip r:embed="rId10">
+                    <a:blip r:embed="rId7">
                       <a:extLst>
                         <a:ext uri="{28A0092B-C50C-407E-A947-70E740481C1C}">
                           <a14:useLocalDpi xmlns:a14="http://schemas.microsoft.com/office/drawing/2010/main" val="0"/>
@@ -2673,6 +2493,7 @@
       <w:r>
         <w:rPr>
           <w:rFonts w:ascii="Calibri" w:hAnsi="Calibri" w:cs="Calibri"/>
+          <w:noProof/>
           <w:sz w:val="28"/>
           <w:szCs w:val="28"/>
         </w:rPr>
@@ -2694,7 +2515,7 @@
                     </pic:cNvPicPr>
                   </pic:nvPicPr>
                   <pic:blipFill>
-                    <a:blip r:embed="rId11">
+                    <a:blip r:embed="rId8">
                       <a:extLst>
                         <a:ext uri="{28A0092B-C50C-407E-A947-70E740481C1C}">
                           <a14:useLocalDpi xmlns:a14="http://schemas.microsoft.com/office/drawing/2010/main" val="0"/>
@@ -2848,7 +2669,6 @@
           <w:sz w:val="28"/>
           <w:szCs w:val="28"/>
         </w:rPr>
-        <w:lastRenderedPageBreak/>
         <w:t>Jenkins Executes</w:t>
       </w:r>
     </w:p>
@@ -2938,6 +2758,7 @@
                 <w:sz w:val="28"/>
                 <w:szCs w:val="28"/>
               </w:rPr>
+              <w:lastRenderedPageBreak/>
               <w:t>Phase</w:t>
             </w:r>
           </w:p>
@@ -3423,7 +3244,7 @@
           <w:szCs w:val="28"/>
         </w:rPr>
         <w:pict w14:anchorId="3E8F1430">
-          <v:rect id="_x0000_i1289" style="width:0;height:1.5pt" o:hralign="center" o:hrstd="t" o:hr="t" fillcolor="#a0a0a0" stroked="f"/>
+          <v:rect id="_x0000_i1031" style="width:0;height:1.5pt" o:hralign="center" o:hrstd="t" o:hr="t" fillcolor="#a0a0a0" stroked="f"/>
         </w:pict>
       </w:r>
     </w:p>
@@ -3481,6 +3302,7 @@
       <w:r>
         <w:rPr>
           <w:rFonts w:ascii="Calibri" w:hAnsi="Calibri" w:cs="Calibri"/>
+          <w:noProof/>
           <w:sz w:val="28"/>
           <w:szCs w:val="28"/>
         </w:rPr>
@@ -3502,7 +3324,7 @@
                     </pic:cNvPicPr>
                   </pic:nvPicPr>
                   <pic:blipFill>
-                    <a:blip r:embed="rId12">
+                    <a:blip r:embed="rId9">
                       <a:extLst>
                         <a:ext uri="{28A0092B-C50C-407E-A947-70E740481C1C}">
                           <a14:useLocalDpi xmlns:a14="http://schemas.microsoft.com/office/drawing/2010/main" val="0"/>
@@ -3546,6 +3368,7 @@
       <w:r>
         <w:rPr>
           <w:rFonts w:ascii="Calibri" w:hAnsi="Calibri" w:cs="Calibri"/>
+          <w:noProof/>
           <w:sz w:val="28"/>
           <w:szCs w:val="28"/>
         </w:rPr>
@@ -3568,7 +3391,7 @@
                     </pic:cNvPicPr>
                   </pic:nvPicPr>
                   <pic:blipFill>
-                    <a:blip r:embed="rId13">
+                    <a:blip r:embed="rId10">
                       <a:extLst>
                         <a:ext uri="{28A0092B-C50C-407E-A947-70E740481C1C}">
                           <a14:useLocalDpi xmlns:a14="http://schemas.microsoft.com/office/drawing/2010/main" val="0"/>
@@ -3612,6 +3435,7 @@
       <w:r>
         <w:rPr>
           <w:rFonts w:ascii="Calibri" w:hAnsi="Calibri" w:cs="Calibri"/>
+          <w:noProof/>
           <w:sz w:val="28"/>
           <w:szCs w:val="28"/>
         </w:rPr>
@@ -3633,7 +3457,7 @@
                     </pic:cNvPicPr>
                   </pic:nvPicPr>
                   <pic:blipFill>
-                    <a:blip r:embed="rId14">
+                    <a:blip r:embed="rId11">
                       <a:extLst>
                         <a:ext uri="{28A0092B-C50C-407E-A947-70E740481C1C}">
                           <a14:useLocalDpi xmlns:a14="http://schemas.microsoft.com/office/drawing/2010/main" val="0"/>
@@ -4015,7 +3839,7 @@
           <w:szCs w:val="28"/>
         </w:rPr>
         <w:pict w14:anchorId="455FB8A2">
-          <v:rect id="_x0000_i1293" style="width:0;height:1.5pt" o:hralign="center" o:hrstd="t" o:hr="t" fillcolor="#a0a0a0" stroked="f"/>
+          <v:rect id="_x0000_i1032" style="width:0;height:1.5pt" o:hralign="center" o:hrstd="t" o:hr="t" fillcolor="#a0a0a0" stroked="f"/>
         </w:pict>
       </w:r>
     </w:p>
@@ -4057,7 +3881,7 @@
           <w:szCs w:val="28"/>
         </w:rPr>
         <w:pict w14:anchorId="043AECEE">
-          <v:rect id="_x0000_i1294" style="width:0;height:1.5pt" o:hralign="center" o:hrstd="t" o:hr="t" fillcolor="#a0a0a0" stroked="f"/>
+          <v:rect id="_x0000_i1033" style="width:0;height:1.5pt" o:hralign="center" o:hrstd="t" o:hr="t" fillcolor="#a0a0a0" stroked="f"/>
         </w:pict>
       </w:r>
     </w:p>
@@ -4115,6 +3939,7 @@
       <w:r>
         <w:rPr>
           <w:rFonts w:ascii="Calibri" w:hAnsi="Calibri" w:cs="Calibri"/>
+          <w:noProof/>
           <w:sz w:val="28"/>
           <w:szCs w:val="28"/>
         </w:rPr>
@@ -4136,7 +3961,7 @@
                     </pic:cNvPicPr>
                   </pic:nvPicPr>
                   <pic:blipFill>
-                    <a:blip r:embed="rId15">
+                    <a:blip r:embed="rId12">
                       <a:extLst>
                         <a:ext uri="{28A0092B-C50C-407E-A947-70E740481C1C}">
                           <a14:useLocalDpi xmlns:a14="http://schemas.microsoft.com/office/drawing/2010/main" val="0"/>
@@ -4180,6 +4005,7 @@
       <w:r>
         <w:rPr>
           <w:rFonts w:ascii="Calibri" w:hAnsi="Calibri" w:cs="Calibri"/>
+          <w:noProof/>
           <w:sz w:val="28"/>
           <w:szCs w:val="28"/>
         </w:rPr>
@@ -4201,7 +4027,7 @@
                     </pic:cNvPicPr>
                   </pic:nvPicPr>
                   <pic:blipFill>
-                    <a:blip r:embed="rId16">
+                    <a:blip r:embed="rId13">
                       <a:extLst>
                         <a:ext uri="{28A0092B-C50C-407E-A947-70E740481C1C}">
                           <a14:useLocalDpi xmlns:a14="http://schemas.microsoft.com/office/drawing/2010/main" val="0"/>
@@ -4245,6 +4071,7 @@
       <w:r>
         <w:rPr>
           <w:rFonts w:ascii="Calibri" w:hAnsi="Calibri" w:cs="Calibri"/>
+          <w:noProof/>
           <w:sz w:val="28"/>
           <w:szCs w:val="28"/>
         </w:rPr>
@@ -4267,7 +4094,7 @@
                     </pic:cNvPicPr>
                   </pic:nvPicPr>
                   <pic:blipFill>
-                    <a:blip r:embed="rId17">
+                    <a:blip r:embed="rId14">
                       <a:extLst>
                         <a:ext uri="{28A0092B-C50C-407E-A947-70E740481C1C}">
                           <a14:useLocalDpi xmlns:a14="http://schemas.microsoft.com/office/drawing/2010/main" val="0"/>
@@ -4625,7 +4452,7 @@
           <w:szCs w:val="28"/>
         </w:rPr>
         <w:pict w14:anchorId="44847945">
-          <v:rect id="_x0000_i1298" style="width:0;height:1.5pt" o:hralign="center" o:hrstd="t" o:hr="t" fillcolor="#a0a0a0" stroked="f"/>
+          <v:rect id="_x0000_i1034" style="width:0;height:1.5pt" o:hralign="center" o:hrstd="t" o:hr="t" fillcolor="#a0a0a0" stroked="f"/>
         </w:pict>
       </w:r>
     </w:p>
@@ -4687,7 +4514,7 @@
           <w:szCs w:val="28"/>
         </w:rPr>
         <w:pict w14:anchorId="292D248F">
-          <v:rect id="_x0000_i1299" style="width:0;height:1.5pt" o:hralign="center" o:hrstd="t" o:hr="t" fillcolor="#a0a0a0" stroked="f"/>
+          <v:rect id="_x0000_i1035" style="width:0;height:1.5pt" o:hralign="center" o:hrstd="t" o:hr="t" fillcolor="#a0a0a0" stroked="f"/>
         </w:pict>
       </w:r>
     </w:p>
@@ -4735,6 +4562,7 @@
       <w:r>
         <w:rPr>
           <w:rFonts w:ascii="Calibri" w:hAnsi="Calibri" w:cs="Calibri"/>
+          <w:noProof/>
           <w:sz w:val="28"/>
           <w:szCs w:val="28"/>
         </w:rPr>
@@ -4757,7 +4585,7 @@
                     </pic:cNvPicPr>
                   </pic:nvPicPr>
                   <pic:blipFill>
-                    <a:blip r:embed="rId18">
+                    <a:blip r:embed="rId15">
                       <a:extLst>
                         <a:ext uri="{28A0092B-C50C-407E-A947-70E740481C1C}">
                           <a14:useLocalDpi xmlns:a14="http://schemas.microsoft.com/office/drawing/2010/main" val="0"/>
@@ -4801,6 +4629,7 @@
       <w:r>
         <w:rPr>
           <w:rFonts w:ascii="Calibri" w:hAnsi="Calibri" w:cs="Calibri"/>
+          <w:noProof/>
           <w:sz w:val="28"/>
           <w:szCs w:val="28"/>
         </w:rPr>
@@ -4823,7 +4652,7 @@
                     </pic:cNvPicPr>
                   </pic:nvPicPr>
                   <pic:blipFill>
-                    <a:blip r:embed="rId19">
+                    <a:blip r:embed="rId16">
                       <a:extLst>
                         <a:ext uri="{28A0092B-C50C-407E-A947-70E740481C1C}">
                           <a14:useLocalDpi xmlns:a14="http://schemas.microsoft.com/office/drawing/2010/main" val="0"/>
@@ -4877,6 +4706,7 @@
       <w:r>
         <w:rPr>
           <w:rFonts w:ascii="Calibri" w:hAnsi="Calibri" w:cs="Calibri"/>
+          <w:noProof/>
           <w:sz w:val="28"/>
           <w:szCs w:val="28"/>
         </w:rPr>
@@ -4898,7 +4728,7 @@
                     </pic:cNvPicPr>
                   </pic:nvPicPr>
                   <pic:blipFill>
-                    <a:blip r:embed="rId20">
+                    <a:blip r:embed="rId17">
                       <a:extLst>
                         <a:ext uri="{28A0092B-C50C-407E-A947-70E740481C1C}">
                           <a14:useLocalDpi xmlns:a14="http://schemas.microsoft.com/office/drawing/2010/main" val="0"/>
@@ -5493,7 +5323,7 @@
           <w:szCs w:val="28"/>
         </w:rPr>
         <w:pict w14:anchorId="62217476">
-          <v:rect id="_x0000_i1303" style="width:0;height:1.5pt" o:hralign="center" o:hrstd="t" o:hr="t" fillcolor="#a0a0a0" stroked="f"/>
+          <v:rect id="_x0000_i1036" style="width:0;height:1.5pt" o:hralign="center" o:hrstd="t" o:hr="t" fillcolor="#a0a0a0" stroked="f"/>
         </w:pict>
       </w:r>
     </w:p>
@@ -5541,6 +5371,7 @@
       <w:r>
         <w:rPr>
           <w:rFonts w:ascii="Calibri" w:hAnsi="Calibri" w:cs="Calibri"/>
+          <w:noProof/>
           <w:sz w:val="28"/>
           <w:szCs w:val="28"/>
         </w:rPr>
@@ -5562,7 +5393,7 @@
                     </pic:cNvPicPr>
                   </pic:nvPicPr>
                   <pic:blipFill>
-                    <a:blip r:embed="rId21">
+                    <a:blip r:embed="rId18">
                       <a:extLst>
                         <a:ext uri="{28A0092B-C50C-407E-A947-70E740481C1C}">
                           <a14:useLocalDpi xmlns:a14="http://schemas.microsoft.com/office/drawing/2010/main" val="0"/>
@@ -5606,6 +5437,7 @@
       <w:r>
         <w:rPr>
           <w:rFonts w:ascii="Calibri" w:hAnsi="Calibri" w:cs="Calibri"/>
+          <w:noProof/>
           <w:sz w:val="28"/>
           <w:szCs w:val="28"/>
         </w:rPr>
@@ -5628,7 +5460,7 @@
                     </pic:cNvPicPr>
                   </pic:nvPicPr>
                   <pic:blipFill>
-                    <a:blip r:embed="rId22">
+                    <a:blip r:embed="rId19">
                       <a:extLst>
                         <a:ext uri="{28A0092B-C50C-407E-A947-70E740481C1C}">
                           <a14:useLocalDpi xmlns:a14="http://schemas.microsoft.com/office/drawing/2010/main" val="0"/>
@@ -5672,6 +5504,7 @@
       <w:r>
         <w:rPr>
           <w:rFonts w:ascii="Calibri" w:hAnsi="Calibri" w:cs="Calibri"/>
+          <w:noProof/>
           <w:sz w:val="28"/>
           <w:szCs w:val="28"/>
         </w:rPr>
@@ -5734,7 +5567,7 @@
           </mc:Choice>
           <mc:Fallback>
             <w:pict>
-              <v:rect w14:anchorId="65239225" id="Rectangle 37" o:spid="_x0000_s1026" style="width:24pt;height:24pt;visibility:visible;mso-wrap-style:square;mso-left-percent:-10001;mso-top-percent:-10001;mso-position-horizontal:absolute;mso-position-horizontal-relative:char;mso-position-vertical:absolute;mso-position-vertical-relative:line;mso-left-percent:-10001;mso-top-percent:-10001;v-text-anchor:top" o:gfxdata="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" filled="f" stroked="f">
+              <v:rect w14:anchorId="062212AE" id="Rectangle 37" o:spid="_x0000_s1026" style="width:24pt;height:24pt;visibility:visible;mso-wrap-style:square;mso-left-percent:-10001;mso-top-percent:-10001;mso-position-horizontal:absolute;mso-position-horizontal-relative:char;mso-position-vertical:absolute;mso-position-vertical-relative:line;mso-left-percent:-10001;mso-top-percent:-10001;v-text-anchor:top" o:gfxdata="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" filled="f" stroked="f">
                 <o:lock v:ext="edit" aspectratio="t"/>
                 <w10:anchorlock/>
               </v:rect>
@@ -6237,7 +6070,7 @@
           <w:szCs w:val="28"/>
         </w:rPr>
         <w:pict w14:anchorId="7A8B32F7">
-          <v:rect id="_x0000_i1307" style="width:0;height:1.5pt" o:hralign="center" o:hrstd="t" o:hr="t" fillcolor="#a0a0a0" stroked="f"/>
+          <v:rect id="_x0000_i1037" style="width:0;height:1.5pt" o:hralign="center" o:hrstd="t" o:hr="t" fillcolor="#a0a0a0" stroked="f"/>
         </w:pict>
       </w:r>
     </w:p>
@@ -6295,6 +6128,7 @@
       <w:r>
         <w:rPr>
           <w:rFonts w:ascii="Calibri" w:hAnsi="Calibri" w:cs="Calibri"/>
+          <w:noProof/>
           <w:sz w:val="28"/>
           <w:szCs w:val="28"/>
         </w:rPr>
@@ -6317,7 +6151,7 @@
                     </pic:cNvPicPr>
                   </pic:nvPicPr>
                   <pic:blipFill>
-                    <a:blip r:embed="rId23">
+                    <a:blip r:embed="rId20">
                       <a:extLst>
                         <a:ext uri="{28A0092B-C50C-407E-A947-70E740481C1C}">
                           <a14:useLocalDpi xmlns:a14="http://schemas.microsoft.com/office/drawing/2010/main" val="0"/>
@@ -6361,6 +6195,7 @@
       <w:r>
         <w:rPr>
           <w:rFonts w:ascii="Calibri" w:hAnsi="Calibri" w:cs="Calibri"/>
+          <w:noProof/>
           <w:sz w:val="28"/>
           <w:szCs w:val="28"/>
         </w:rPr>
@@ -6382,7 +6217,7 @@
                     </pic:cNvPicPr>
                   </pic:nvPicPr>
                   <pic:blipFill>
-                    <a:blip r:embed="rId24" cstate="print">
+                    <a:blip r:embed="rId21" cstate="print">
                       <a:extLst>
                         <a:ext uri="{28A0092B-C50C-407E-A947-70E740481C1C}">
                           <a14:useLocalDpi xmlns:a14="http://schemas.microsoft.com/office/drawing/2010/main" val="0"/>
@@ -6426,6 +6261,7 @@
       <w:r>
         <w:rPr>
           <w:rFonts w:ascii="Calibri" w:hAnsi="Calibri" w:cs="Calibri"/>
+          <w:noProof/>
           <w:sz w:val="28"/>
           <w:szCs w:val="28"/>
         </w:rPr>
@@ -6448,7 +6284,7 @@
                     </pic:cNvPicPr>
                   </pic:nvPicPr>
                   <pic:blipFill>
-                    <a:blip r:embed="rId25">
+                    <a:blip r:embed="rId22">
                       <a:extLst>
                         <a:ext uri="{28A0092B-C50C-407E-A947-70E740481C1C}">
                           <a14:useLocalDpi xmlns:a14="http://schemas.microsoft.com/office/drawing/2010/main" val="0"/>
@@ -6928,7 +6764,7 @@
           <w:szCs w:val="28"/>
         </w:rPr>
         <w:pict w14:anchorId="163AFA47">
-          <v:rect id="_x0000_i1311" style="width:0;height:1.5pt" o:hralign="center" o:hrstd="t" o:hr="t" fillcolor="#a0a0a0" stroked="f"/>
+          <v:rect id="_x0000_i1038" style="width:0;height:1.5pt" o:hralign="center" o:hrstd="t" o:hr="t" fillcolor="#a0a0a0" stroked="f"/>
         </w:pict>
       </w:r>
     </w:p>
@@ -6986,6 +6822,7 @@
       <w:r>
         <w:rPr>
           <w:rFonts w:ascii="Calibri" w:hAnsi="Calibri" w:cs="Calibri"/>
+          <w:noProof/>
           <w:sz w:val="28"/>
           <w:szCs w:val="28"/>
         </w:rPr>
@@ -7008,7 +6845,7 @@
                     </pic:cNvPicPr>
                   </pic:nvPicPr>
                   <pic:blipFill>
-                    <a:blip r:embed="rId26">
+                    <a:blip r:embed="rId23">
                       <a:extLst>
                         <a:ext uri="{28A0092B-C50C-407E-A947-70E740481C1C}">
                           <a14:useLocalDpi xmlns:a14="http://schemas.microsoft.com/office/drawing/2010/main" val="0"/>
@@ -7052,6 +6889,7 @@
       <w:r>
         <w:rPr>
           <w:rFonts w:ascii="Calibri" w:hAnsi="Calibri" w:cs="Calibri"/>
+          <w:noProof/>
           <w:sz w:val="28"/>
           <w:szCs w:val="28"/>
         </w:rPr>
@@ -7073,7 +6911,7 @@
                     </pic:cNvPicPr>
                   </pic:nvPicPr>
                   <pic:blipFill>
-                    <a:blip r:embed="rId27">
+                    <a:blip r:embed="rId24">
                       <a:extLst>
                         <a:ext uri="{28A0092B-C50C-407E-A947-70E740481C1C}">
                           <a14:useLocalDpi xmlns:a14="http://schemas.microsoft.com/office/drawing/2010/main" val="0"/>
@@ -7117,6 +6955,7 @@
       <w:r>
         <w:rPr>
           <w:rFonts w:ascii="Calibri" w:hAnsi="Calibri" w:cs="Calibri"/>
+          <w:noProof/>
           <w:sz w:val="28"/>
           <w:szCs w:val="28"/>
         </w:rPr>
@@ -7139,7 +6978,7 @@
                     </pic:cNvPicPr>
                   </pic:nvPicPr>
                   <pic:blipFill>
-                    <a:blip r:embed="rId28" cstate="print">
+                    <a:blip r:embed="rId25" cstate="print">
                       <a:extLst>
                         <a:ext uri="{28A0092B-C50C-407E-A947-70E740481C1C}">
                           <a14:useLocalDpi xmlns:a14="http://schemas.microsoft.com/office/drawing/2010/main" val="0"/>
@@ -7373,7 +7212,7 @@
           <w:szCs w:val="28"/>
         </w:rPr>
         <w:pict w14:anchorId="108E5459">
-          <v:rect id="_x0000_i1315" style="width:0;height:1.5pt" o:hralign="center" o:hrstd="t" o:hr="t" fillcolor="#a0a0a0" stroked="f"/>
+          <v:rect id="_x0000_i1039" style="width:0;height:1.5pt" o:hralign="center" o:hrstd="t" o:hr="t" fillcolor="#a0a0a0" stroked="f"/>
         </w:pict>
       </w:r>
     </w:p>
@@ -7570,7 +7409,7 @@
           <w:szCs w:val="28"/>
         </w:rPr>
         <w:pict w14:anchorId="3F469B5F">
-          <v:rect id="_x0000_i1316" style="width:0;height:1.5pt" o:hralign="center" o:hrstd="t" o:hr="t" fillcolor="#a0a0a0" stroked="f"/>
+          <v:rect id="_x0000_i1040" style="width:0;height:1.5pt" o:hralign="center" o:hrstd="t" o:hr="t" fillcolor="#a0a0a0" stroked="f"/>
         </w:pict>
       </w:r>
     </w:p>
@@ -7607,6 +7446,7 @@
           <w:rFonts w:ascii="Calibri" w:hAnsi="Calibri" w:cs="Calibri"/>
           <w:sz w:val="28"/>
           <w:szCs w:val="28"/>
+          <w:highlight w:val="yellow"/>
         </w:rPr>
       </w:pPr>
       <w:r>
@@ -7614,6 +7454,7 @@
           <w:rFonts w:ascii="Segoe UI Symbol" w:hAnsi="Segoe UI Symbol" w:cs="Segoe UI Symbol"/>
           <w:sz w:val="28"/>
           <w:szCs w:val="28"/>
+          <w:highlight w:val="yellow"/>
         </w:rPr>
         <w:t>✔</w:t>
       </w:r>
@@ -7622,6 +7463,7 @@
           <w:rFonts w:ascii="Calibri" w:hAnsi="Calibri" w:cs="Calibri"/>
           <w:sz w:val="28"/>
           <w:szCs w:val="28"/>
+          <w:highlight w:val="yellow"/>
         </w:rPr>
         <w:t xml:space="preserve"> Jenkinsfile (full production-grade)</w:t>
       </w:r>
@@ -7779,36 +7621,75 @@
     <w:p>
       <w:pPr>
         <w:pStyle w:val="NoSpacing"/>
-        <w:rPr>
-          <w:rFonts w:ascii="Calibri" w:hAnsi="Calibri" w:cs="Calibri"/>
-          <w:sz w:val="28"/>
-          <w:szCs w:val="28"/>
-        </w:rPr>
-      </w:pPr>
-    </w:p>
-    <w:p>
-      <w:pPr>
-        <w:pStyle w:val="NoSpacing"/>
-        <w:rPr>
-          <w:rFonts w:ascii="Calibri" w:hAnsi="Calibri" w:cs="Calibri"/>
-          <w:b/>
-          <w:bCs/>
-          <w:sz w:val="28"/>
-          <w:szCs w:val="28"/>
-        </w:rPr>
-      </w:pPr>
-    </w:p>
-    <w:p>
-      <w:pPr>
-        <w:pStyle w:val="NoSpacing"/>
-        <w:rPr>
-          <w:rFonts w:ascii="Calibri" w:hAnsi="Calibri" w:cs="Calibri"/>
-          <w:b/>
-          <w:bCs/>
-          <w:sz w:val="28"/>
-          <w:szCs w:val="28"/>
-        </w:rPr>
-      </w:pPr>
+      </w:pPr>
+      <w:hyperlink r:id="rId26" w:history="1">
+        <w:r>
+          <w:rPr>
+            <w:rStyle w:val="Hyperlink"/>
+            <w:rFonts w:ascii="Calibri" w:hAnsi="Calibri" w:cs="Calibri"/>
+            <w:b/>
+            <w:bCs/>
+            <w:sz w:val="28"/>
+            <w:szCs w:val="28"/>
+          </w:rPr>
+          <w:t>https://www.youtube.com/watch?v=PKcGy9oPVXg&amp;t=</w:t>
+        </w:r>
+        <w:r>
+          <w:rPr>
+            <w:rStyle w:val="Hyperlink"/>
+            <w:rFonts w:ascii="Calibri" w:hAnsi="Calibri" w:cs="Calibri"/>
+            <w:b/>
+            <w:bCs/>
+            <w:sz w:val="28"/>
+            <w:szCs w:val="28"/>
+          </w:rPr>
+          <w:t>1</w:t>
+        </w:r>
+        <w:r>
+          <w:rPr>
+            <w:rStyle w:val="Hyperlink"/>
+            <w:rFonts w:ascii="Calibri" w:hAnsi="Calibri" w:cs="Calibri"/>
+            <w:b/>
+            <w:bCs/>
+            <w:sz w:val="28"/>
+            <w:szCs w:val="28"/>
+          </w:rPr>
+          <w:t>2s</w:t>
+        </w:r>
+      </w:hyperlink>
+    </w:p>
+    <w:p>
+      <w:pPr>
+        <w:pStyle w:val="NoSpacing"/>
+      </w:pPr>
+    </w:p>
+    <w:p>
+      <w:pPr>
+        <w:pStyle w:val="NoSpacing"/>
+        <w:rPr>
+          <w:rFonts w:ascii="Calibri" w:hAnsi="Calibri" w:cs="Calibri"/>
+          <w:b/>
+          <w:bCs/>
+          <w:sz w:val="28"/>
+          <w:szCs w:val="28"/>
+        </w:rPr>
+      </w:pPr>
+      <w:r>
+        <w:t xml:space="preserve">Blue Ocean Plugin – </w:t>
+      </w:r>
+      <w:proofErr w:type="spellStart"/>
+      <w:r>
+        <w:t>Fro</w:t>
+      </w:r>
+      <w:proofErr w:type="spellEnd"/>
+      <w:r>
+        <w:t xml:space="preserve"> </w:t>
+      </w:r>
+      <w:proofErr w:type="spellStart"/>
+      <w:r>
+        <w:t>viwing</w:t>
+      </w:r>
+      <w:proofErr w:type="spellEnd"/>
     </w:p>
     <w:p>
       <w:pPr>
@@ -12166,6 +12047,7 @@
   <w:style w:type="character" w:default="1" w:styleId="DefaultParagraphFont">
     <w:name w:val="Default Paragraph Font"/>
     <w:uiPriority w:val="1"/>
+    <w:semiHidden/>
     <w:unhideWhenUsed/>
   </w:style>
   <w:style w:type="table" w:default="1" w:styleId="TableNormal">
@@ -12488,6 +12370,41 @@
       <w:spacing w:after="0" w:line="240" w:lineRule="auto"/>
     </w:pPr>
   </w:style>
+  <w:style w:type="character" w:styleId="Hyperlink">
+    <w:name w:val="Hyperlink"/>
+    <w:basedOn w:val="DefaultParagraphFont"/>
+    <w:uiPriority w:val="99"/>
+    <w:unhideWhenUsed/>
+    <w:rsid w:val="00084F72"/>
+    <w:rPr>
+      <w:color w:val="0563C1" w:themeColor="hyperlink"/>
+      <w:u w:val="single"/>
+    </w:rPr>
+  </w:style>
+  <w:style w:type="character" w:styleId="UnresolvedMention">
+    <w:name w:val="Unresolved Mention"/>
+    <w:basedOn w:val="DefaultParagraphFont"/>
+    <w:uiPriority w:val="99"/>
+    <w:semiHidden/>
+    <w:unhideWhenUsed/>
+    <w:rsid w:val="00084F72"/>
+    <w:rPr>
+      <w:color w:val="605E5C"/>
+      <w:shd w:val="clear" w:color="auto" w:fill="E1DFDD"/>
+    </w:rPr>
+  </w:style>
+  <w:style w:type="character" w:styleId="FollowedHyperlink">
+    <w:name w:val="FollowedHyperlink"/>
+    <w:basedOn w:val="DefaultParagraphFont"/>
+    <w:uiPriority w:val="99"/>
+    <w:semiHidden/>
+    <w:unhideWhenUsed/>
+    <w:rsid w:val="00F64A77"/>
+    <w:rPr>
+      <w:color w:val="954F72" w:themeColor="followedHyperlink"/>
+      <w:u w:val="single"/>
+    </w:rPr>
+  </w:style>
 </w:styles>
 </file>
 

</xml_diff>